<commit_message>
docs(paper): drop standalone Limitations section per guide's point #12
The prior commit resolved points #5/#7/#8 but left a "III. Limitations"
section in Paper 2 -- the guide's point #12 ("eliminate limitation and
drawbacks") was still unaddressed. It was also redundant: the one
substantive limitation (ReID gap) was already restated near-verbatim in
the Conclusion's future-work list. Removed the section, renumbered
Conclusion III->III (was IV), rebuilt and visually re-verified all 4 pages.
</commit_message>
<xml_diff>
--- a/docs/paper/IJSRSET_paper2_results_conclusion.docx
+++ b/docs/paper/IJSRSET_paper2_results_conclusion.docx
@@ -2576,39 +2576,7 @@
           <w:sz w:val="20"/>
           <w:szCs w:val="20"/>
         </w:rPr>
-        <w:t xml:space="preserve">III. Limitations</w:t>
-      </w:r>
-    </w:p>
-    <w:p>
-      <w:pPr>
-        <w:spacing w:after="120"/>
-        <w:ind w:firstLine="240"/>
-        <w:jc w:val="both"/>
-      </w:pPr>
-      <w:r>
-        <w:rPr>
-          <w:rFonts w:ascii="Times New Roman" w:cs="Times New Roman" w:eastAsia="Times New Roman" w:hAnsi="Times New Roman"/>
-          <w:sz w:val="20"/>
-          <w:szCs w:val="20"/>
-        </w:rPr>
-        <w:t xml:space="preserve">One limitation is noted briefly. Cross-camera re-identification uses an off-the-shelf backbone without metric-learning fine-tuning, so its accuracy trails fine-tuned systems; fine-tuning on VeRi-776's own training split is planned future work.</w:t>
-      </w:r>
-    </w:p>
-    <w:p>
-      <w:pPr>
-        <w:spacing w:after="120" w:before="240"/>
-        <w:jc w:val="center"/>
-      </w:pPr>
-      <w:r>
-        <w:rPr>
-          <w:rFonts w:ascii="Times New Roman" w:cs="Times New Roman" w:eastAsia="Times New Roman" w:hAnsi="Times New Roman"/>
-          <w:b/>
-          <w:bCs/>
-          <w:smallCaps/>
-          <w:sz w:val="20"/>
-          <w:szCs w:val="20"/>
-        </w:rPr>
-        <w:t xml:space="preserve">IV. Conclusion</w:t>
+        <w:t xml:space="preserve">III. Conclusion</w:t>
       </w:r>
     </w:p>
     <w:p>

</xml_diff>